<commit_message>
docs(medium): remove all references to Book 2 from Medium articles
</commit_message>
<xml_diff>
--- a/docs/Medium_Article_1_The_Physics_of_Mind_Thomas_Riebl.docx
+++ b/docs/Medium_Article_1_The_Physics_of_Mind_Thomas_Riebl.docx
@@ -75,7 +75,7 @@
           <w:i/>
           <w:iCs/>
         </w:rPr>
-        <w:t xml:space="preserve">Theoretical Framework: The Conative-Integrative Framework (CIF) &amp; Book 2 (From Beginning to End)</w:t>
+        <w:t xml:space="preserve">Theoretical Framework: The Conative-Integrative Framework (CIF)</w:t>
       </w:r>
       <w:r>
         <w:br/>
@@ -262,36 +262,7 @@
         <w:t xml:space="preserve">The Conative-Integrative Framework (CIF)</w:t>
       </w:r>
       <w:r>
-        <w:t xml:space="preserve">, articulated in my treatise and developed systematically in</w:t>
-      </w:r>
-      <w:r>
-        <w:t xml:space="preserve"> </w:t>
-      </w:r>
-      <w:r>
-        <w:rPr>
-          <w:b/>
-          <w:bCs/>
-        </w:rPr>
-        <w:t xml:space="preserve">Book 2 (</w:t>
-      </w:r>
-      <w:r>
-        <w:rPr>
-          <w:b/>
-          <w:bCs/>
-          <w:i/>
-          <w:iCs/>
-        </w:rPr>
-        <w:t xml:space="preserve">From Beginning to End</w:t>
-      </w:r>
-      <w:r>
-        <w:rPr>
-          <w:b/>
-          <w:bCs/>
-        </w:rPr>
-        <w:t xml:space="preserve">)</w:t>
-      </w:r>
-      <w:r>
-        <w:t xml:space="preserve">, rejects this intellectual surrender. By establishing a rigorous mathematical synthesis between three cutting-edge fields—</w:t>
+        <w:t xml:space="preserve">, articulated in our mathematical treatises and computational simulations, rejects this intellectual surrender. By establishing a rigorous mathematical synthesis between three cutting-edge fields—</w:t>
       </w:r>
       <w:r>
         <w:rPr>
@@ -880,7 +851,7 @@
         <w:pStyle w:val="FirstParagraph"/>
       </w:pPr>
       <w:r>
-        <w:t xml:space="preserve">In my monograph, I formalize the missing link that bridges Tononi’s</w:t>
+        <w:t xml:space="preserve">In our framework, we formalize the missing link that bridges Tononi’s</w:t>
       </w:r>
       <w:r>
         <w:t xml:space="preserve"> </w:t>
@@ -1424,36 +1395,7 @@
         <w:pStyle w:val="FirstParagraph"/>
       </w:pPr>
       <w:r>
-        <w:t xml:space="preserve">This brings us to the centerpiece of</w:t>
-      </w:r>
-      <w:r>
-        <w:t xml:space="preserve"> </w:t>
-      </w:r>
-      <w:r>
-        <w:rPr>
-          <w:b/>
-          <w:bCs/>
-        </w:rPr>
-        <w:t xml:space="preserve">Book 2 (</w:t>
-      </w:r>
-      <w:r>
-        <w:rPr>
-          <w:b/>
-          <w:bCs/>
-          <w:i/>
-          <w:iCs/>
-        </w:rPr>
-        <w:t xml:space="preserve">From Beginning to End</w:t>
-      </w:r>
-      <w:r>
-        <w:rPr>
-          <w:b/>
-          <w:bCs/>
-        </w:rPr>
-        <w:t xml:space="preserve">)</w:t>
-      </w:r>
-      <w:r>
-        <w:t xml:space="preserve">: the complete resolution of the paradox of time.</w:t>
+        <w:t xml:space="preserve">This brings us to the central temporal mechanics of the framework: the complete resolution of the paradox of time.</w:t>
       </w:r>
     </w:p>
     <w:p>
@@ -1525,13 +1467,13 @@
         <w:t xml:space="preserve">seconds?</w:t>
       </w:r>
     </w:p>
-    <w:bookmarkStart w:id="18" w:name="Xcf280c69c13a6f23ee046744c80831b29974ab6"/>
+    <w:bookmarkStart w:id="18" w:name="the-pure-ontology-of-phase-space"/>
     <w:p>
       <w:pPr>
         <w:pStyle w:val="Heading3"/>
       </w:pPr>
       <w:r>
-        <w:t xml:space="preserve">Thesis 7.1: The Pure Ontology of Phase Space</w:t>
+        <w:t xml:space="preserve">The Pure Ontology of Phase Space</w:t>
       </w:r>
     </w:p>
     <w:p>
@@ -1539,7 +1481,7 @@
         <w:pStyle w:val="FirstParagraph"/>
       </w:pPr>
       <w:r>
-        <w:t xml:space="preserve">In Section 7.1 of our framework, we establish a radical ontological claim:</w:t>
+        <w:t xml:space="preserve">In the Conative-Integrative Framework, we establish a radical ontological claim:</w:t>
       </w:r>
     </w:p>
     <w:p>
@@ -2326,7 +2268,7 @@
         <w:t xml:space="preserve"> </w:t>
       </w:r>
       <w:r>
-        <w:t xml:space="preserve">Once the present action is taken, you surrender attachment to unmanifested futures. If environmental noise perturbs your path, your generative model simply samples a fresh bundle of trails at the next</w:t>
+        <w:t xml:space="preserve">Once the present action is taken, you surrender attachment to unmanifested paths. If environmental noise perturbs your path, your generative model simply samples a fresh bundle of trails at the next</w:t>
       </w:r>
       <w:r>
         <w:t xml:space="preserve"> </w:t>
@@ -2375,13 +2317,13 @@
       </w:r>
     </w:p>
     <w:bookmarkEnd w:id="21"/>
-    <w:bookmarkStart w:id="26" w:name="conclusion-book-2-and-the-horizon-ahead"/>
+    <w:bookmarkStart w:id="26" w:name="conclusion-the-horizon-ahead"/>
     <w:p>
       <w:pPr>
         <w:pStyle w:val="Heading2"/>
       </w:pPr>
       <w:r>
-        <w:t xml:space="preserve">Conclusion: Book 2 and the Horizon Ahead</w:t>
+        <w:t xml:space="preserve">Conclusion: The Horizon Ahead</w:t>
       </w:r>
     </w:p>
     <w:p>

</xml_diff>